<commit_message>
chore(i18n): fill in missing locale translations (#184)
Fill the remaining null strings across all nine locales so they no longer
fall back to English.

Co-authored-by: Claude Fable 5 <noreply@anthropic.com>
</commit_message>
<xml_diff>
--- a/e2e/fixtures/footer-page-number.docx
+++ b/e2e/fixtures/footer-page-number.docx
@@ -362,7 +362,7 @@
           </w:p>
           <w:p>
             <w:r>
-              <w:t>Jana Kováčová</w:t>
+              <w:t>Jana Vzorová</w:t>
             </w:r>
           </w:p>
         </w:tc>
@@ -6768,7 +6768,7 @@
                 <w:sz w:val="17"/>
                 <w:szCs w:val="17"/>
               </w:rPr>
-              <w:t>Jana Kováčová  ·  Corporate Credit Risk</w:t>
+              <w:t>Jana Vzorová  ·  Corporate Credit Risk</w:t>
             </w:r>
           </w:p>
           <w:p>

</xml_diff>